<commit_message>
Completed testing with Codex CLI and SKILL.md
</commit_message>
<xml_diff>
--- a/codex/cdx1_basics_of_codex_CLI - Copy.docx
+++ b/codex/cdx1_basics_of_codex_CLI - Copy.docx
@@ -395,6 +395,27 @@
           <w:szCs w:val="32"/>
         </w:rPr>
         <w:t>…………………47</w:t>
+      </w:r>
+    </w:p>
+    <w:p>
+      <w:pPr>
+        <w:pStyle w:val="ListParagraph"/>
+        <w:numPr>
+          <w:ilvl w:val="0"/>
+          <w:numId w:val="1"/>
+        </w:numPr>
+        <w:jc w:val="both"/>
+        <w:rPr>
+          <w:sz w:val="32"/>
+          <w:szCs w:val="32"/>
+        </w:rPr>
+      </w:pPr>
+      <w:r>
+        <w:rPr>
+          <w:sz w:val="32"/>
+          <w:szCs w:val="32"/>
+        </w:rPr>
+        <w:t>Codex with Gemini…………………………………………………….</w:t>
       </w:r>
     </w:p>
     <w:p>
@@ -25500,7 +25521,21 @@
           <w:sz w:val="32"/>
           <w:szCs w:val="32"/>
         </w:rPr>
-        <w:t xml:space="preserve"> is required. Other folders are optional and can hold supporting material.</w:t>
+        <w:t xml:space="preserve"> is required</w:t>
+      </w:r>
+      <w:r>
+        <w:rPr>
+          <w:sz w:val="32"/>
+          <w:szCs w:val="32"/>
+        </w:rPr>
+        <w:t xml:space="preserve"> in every skill folder</w:t>
+      </w:r>
+      <w:r>
+        <w:rPr>
+          <w:sz w:val="32"/>
+          <w:szCs w:val="32"/>
+        </w:rPr>
+        <w:t>. Other folders are optional and can hold supporting material.</w:t>
       </w:r>
     </w:p>
     <w:p>
@@ -25577,14 +25612,53 @@
           <w:sz w:val="32"/>
           <w:szCs w:val="32"/>
         </w:rPr>
-        <w:t>architecture-review.md</w:t>
-      </w:r>
-      <w:r>
-        <w:rPr>
-          <w:sz w:val="32"/>
-          <w:szCs w:val="32"/>
-        </w:rPr>
-        <w:t xml:space="preserve"> and inside it</w:t>
+        <w:t>SKILL</w:t>
+      </w:r>
+      <w:r>
+        <w:rPr>
+          <w:b/>
+          <w:bCs/>
+          <w:sz w:val="32"/>
+          <w:szCs w:val="32"/>
+        </w:rPr>
+        <w:t>.md</w:t>
+      </w:r>
+      <w:r>
+        <w:rPr>
+          <w:sz w:val="32"/>
+          <w:szCs w:val="32"/>
+        </w:rPr>
+        <w:t xml:space="preserve"> </w:t>
+      </w:r>
+      <w:r>
+        <w:rPr>
+          <w:sz w:val="32"/>
+          <w:szCs w:val="32"/>
+        </w:rPr>
+        <w:t xml:space="preserve">(folder name is the skill name and </w:t>
+      </w:r>
+      <w:r>
+        <w:rPr>
+          <w:b/>
+          <w:bCs/>
+          <w:sz w:val="32"/>
+          <w:szCs w:val="32"/>
+        </w:rPr>
+        <w:t>SKILL.md</w:t>
+      </w:r>
+      <w:r>
+        <w:rPr>
+          <w:sz w:val="32"/>
+          <w:szCs w:val="32"/>
+        </w:rPr>
+        <w:t xml:space="preserve"> must be the same) </w:t>
+      </w:r>
+      <w:r>
+        <w:rPr>
+          <w:sz w:val="32"/>
+          <w:szCs w:val="32"/>
+        </w:rPr>
+        <w:t>and inside it</w:t>
       </w:r>
     </w:p>
     <w:p>
@@ -25650,12 +25724,9 @@
           <w:sz w:val="32"/>
           <w:szCs w:val="32"/>
         </w:rPr>
-        <w:t>---</w:t>
-      </w:r>
-    </w:p>
-    <w:p>
-      <w:pPr>
-        <w:jc w:val="both"/>
+        <w:t>description: Review Flutter architecture focusing on Clean</w:t>
+      </w:r>
+      <w:r>
         <w:rPr>
           <w:b/>
           <w:bCs/>
@@ -25663,7 +25734,8 @@
           <w:sz w:val="32"/>
           <w:szCs w:val="32"/>
         </w:rPr>
-      </w:pPr>
+        <w:t xml:space="preserve"> </w:t>
+      </w:r>
       <w:r>
         <w:rPr>
           <w:b/>
@@ -25672,7 +25744,7 @@
           <w:sz w:val="32"/>
           <w:szCs w:val="32"/>
         </w:rPr>
-        <w:t>description: Review Flutter architecture focusing on Clean Architecture, SOLID, scalability, and maintainability.</w:t>
+        <w:t>Architecture, SOLID, scalability, and maintainability.</w:t>
       </w:r>
     </w:p>
     <w:p>
@@ -28827,6 +28899,194 @@
           <w:szCs w:val="32"/>
         </w:rPr>
       </w:pPr>
+    </w:p>
+    <w:p>
+      <w:pPr>
+        <w:jc w:val="both"/>
+        <w:rPr>
+          <w:b/>
+          <w:bCs/>
+          <w:sz w:val="32"/>
+          <w:szCs w:val="32"/>
+        </w:rPr>
+      </w:pPr>
+      <w:r>
+        <w:rPr>
+          <w:b/>
+          <w:bCs/>
+          <w:sz w:val="32"/>
+          <w:szCs w:val="32"/>
+        </w:rPr>
+        <w:t>Codex with Gemini:</w:t>
+      </w:r>
+    </w:p>
+    <w:p>
+      <w:pPr>
+        <w:jc w:val="both"/>
+        <w:rPr>
+          <w:sz w:val="32"/>
+          <w:szCs w:val="32"/>
+        </w:rPr>
+      </w:pPr>
+      <w:r>
+        <w:rPr>
+          <w:sz w:val="32"/>
+          <w:szCs w:val="32"/>
+        </w:rPr>
+        <w:t># Tell codex to scan the project and analyze test cases, sort them high priority wise and only implement the high priority tests</w:t>
+      </w:r>
+    </w:p>
+    <w:p>
+      <w:pPr>
+        <w:jc w:val="both"/>
+        <w:rPr>
+          <w:sz w:val="32"/>
+          <w:szCs w:val="32"/>
+        </w:rPr>
+      </w:pPr>
+      <w:r>
+        <w:rPr>
+          <w:sz w:val="32"/>
+          <w:szCs w:val="32"/>
+        </w:rPr>
+        <w:t xml:space="preserve"># After planning instead of telling codex to implement it tell codex to create </w:t>
+      </w:r>
+      <w:proofErr w:type="spellStart"/>
+      <w:r>
+        <w:rPr>
+          <w:b/>
+          <w:bCs/>
+          <w:sz w:val="32"/>
+          <w:szCs w:val="32"/>
+        </w:rPr>
+        <w:t>project_root</w:t>
+      </w:r>
+      <w:proofErr w:type="spellEnd"/>
+      <w:proofErr w:type="gramStart"/>
+      <w:r>
+        <w:rPr>
+          <w:b/>
+          <w:bCs/>
+          <w:sz w:val="32"/>
+          <w:szCs w:val="32"/>
+        </w:rPr>
+        <w:t>/.artifacts</w:t>
+      </w:r>
+      <w:proofErr w:type="gramEnd"/>
+      <w:r>
+        <w:rPr>
+          <w:b/>
+          <w:bCs/>
+          <w:sz w:val="32"/>
+          <w:szCs w:val="32"/>
+        </w:rPr>
+        <w:t xml:space="preserve">/ </w:t>
+      </w:r>
+      <w:r>
+        <w:rPr>
+          <w:sz w:val="32"/>
+          <w:szCs w:val="32"/>
+        </w:rPr>
+        <w:t xml:space="preserve">directory and specify the process or steps in a </w:t>
+      </w:r>
+      <w:r>
+        <w:rPr>
+          <w:b/>
+          <w:bCs/>
+          <w:sz w:val="32"/>
+          <w:szCs w:val="32"/>
+        </w:rPr>
+        <w:t>implementation_plan_artifact.md</w:t>
+      </w:r>
+      <w:r>
+        <w:rPr>
+          <w:b/>
+          <w:bCs/>
+          <w:sz w:val="32"/>
+          <w:szCs w:val="32"/>
+        </w:rPr>
+        <w:t xml:space="preserve"> </w:t>
+      </w:r>
+      <w:r>
+        <w:rPr>
+          <w:sz w:val="32"/>
+          <w:szCs w:val="32"/>
+        </w:rPr>
+        <w:t>file</w:t>
+      </w:r>
+    </w:p>
+    <w:p>
+      <w:pPr>
+        <w:jc w:val="both"/>
+        <w:rPr>
+          <w:sz w:val="32"/>
+          <w:szCs w:val="32"/>
+        </w:rPr>
+      </w:pPr>
+      <w:r>
+        <w:rPr>
+          <w:sz w:val="32"/>
+          <w:szCs w:val="32"/>
+        </w:rPr>
+        <w:t xml:space="preserve"># Then tell Gemini to read </w:t>
+      </w:r>
+      <w:r>
+        <w:rPr>
+          <w:b/>
+          <w:bCs/>
+          <w:sz w:val="32"/>
+          <w:szCs w:val="32"/>
+        </w:rPr>
+        <w:t>unit-tests.md</w:t>
+      </w:r>
+      <w:r>
+        <w:rPr>
+          <w:sz w:val="32"/>
+          <w:szCs w:val="32"/>
+        </w:rPr>
+        <w:t xml:space="preserve"> skill file and implement the tests</w:t>
+      </w:r>
+    </w:p>
+    <w:p>
+      <w:pPr>
+        <w:jc w:val="both"/>
+        <w:rPr>
+          <w:sz w:val="32"/>
+          <w:szCs w:val="32"/>
+        </w:rPr>
+      </w:pPr>
+      <w:r>
+        <w:rPr>
+          <w:sz w:val="32"/>
+          <w:szCs w:val="32"/>
+        </w:rPr>
+        <w:t># Best usage for saving tokens</w:t>
+      </w:r>
+    </w:p>
+    <w:p>
+      <w:pPr>
+        <w:jc w:val="both"/>
+        <w:rPr>
+          <w:sz w:val="32"/>
+          <w:szCs w:val="32"/>
+        </w:rPr>
+      </w:pPr>
+    </w:p>
+    <w:p>
+      <w:pPr>
+        <w:jc w:val="center"/>
+        <w:rPr>
+          <w:sz w:val="32"/>
+          <w:szCs w:val="32"/>
+        </w:rPr>
+      </w:pPr>
+      <w:r>
+        <w:rPr>
+          <w:sz w:val="32"/>
+          <w:szCs w:val="32"/>
+        </w:rPr>
+        <w:t>Break</w:t>
+      </w:r>
     </w:p>
     <w:p>
       <w:pPr>

</xml_diff>

<commit_message>
Added AGENTS.md to efficiently use AI's, added Darts build_runner, json_serializable and code generation
</commit_message>
<xml_diff>
--- a/codex/cdx1_basics_of_codex_CLI - Copy.docx
+++ b/codex/cdx1_basics_of_codex_CLI - Copy.docx
@@ -283,7 +283,16 @@
           <w:sz w:val="32"/>
           <w:szCs w:val="32"/>
         </w:rPr>
-        <w:t>AGENTS.MD</w:t>
+        <w:t>AGENTS.</w:t>
+      </w:r>
+      <w:r>
+        <w:rPr>
+          <w:b/>
+          <w:bCs/>
+          <w:sz w:val="32"/>
+          <w:szCs w:val="32"/>
+        </w:rPr>
+        <w:t>md</w:t>
       </w:r>
       <w:r>
         <w:rPr>
@@ -24015,10 +24024,19 @@
       </w:pPr>
       <w:r>
         <w:rPr>
-          <w:sz w:val="32"/>
-          <w:szCs w:val="32"/>
-        </w:rPr>
-        <w:t>Flutter commands</w:t>
+          <w:b/>
+          <w:bCs/>
+          <w:sz w:val="32"/>
+          <w:szCs w:val="32"/>
+        </w:rPr>
+        <w:t xml:space="preserve">Flutter </w:t>
+      </w:r>
+      <w:r>
+        <w:rPr>
+          <w:sz w:val="32"/>
+          <w:szCs w:val="32"/>
+        </w:rPr>
+        <w:t>commands</w:t>
       </w:r>
     </w:p>
     <w:p>
@@ -24055,7 +24073,30 @@
           <w:sz w:val="32"/>
           <w:szCs w:val="32"/>
         </w:rPr>
-        <w:t># Think of SKILL.md as “How do I perform this specific task?”. Each skill is focused on one repeatable workflow. Examples:</w:t>
+        <w:t xml:space="preserve"># Think of </w:t>
+      </w:r>
+      <w:r>
+        <w:rPr>
+          <w:b/>
+          <w:bCs/>
+          <w:sz w:val="32"/>
+          <w:szCs w:val="32"/>
+        </w:rPr>
+        <w:t xml:space="preserve">SKILL.md </w:t>
+      </w:r>
+      <w:r>
+        <w:rPr>
+          <w:sz w:val="32"/>
+          <w:szCs w:val="32"/>
+        </w:rPr>
+        <w:t>a</w:t>
+      </w:r>
+      <w:r>
+        <w:rPr>
+          <w:sz w:val="32"/>
+          <w:szCs w:val="32"/>
+        </w:rPr>
+        <w:t>s “How do I perform this specific task?”. Each skill is focused on one repeatable workflow. Examples:</w:t>
       </w:r>
     </w:p>
     <w:p>
@@ -24157,10 +24198,19 @@
       </w:pPr>
       <w:r>
         <w:rPr>
-          <w:sz w:val="32"/>
-          <w:szCs w:val="32"/>
-        </w:rPr>
-        <w:t>Firebase security review</w:t>
+          <w:b/>
+          <w:bCs/>
+          <w:sz w:val="32"/>
+          <w:szCs w:val="32"/>
+        </w:rPr>
+        <w:t>Firebase</w:t>
+      </w:r>
+      <w:r>
+        <w:rPr>
+          <w:sz w:val="32"/>
+          <w:szCs w:val="32"/>
+        </w:rPr>
+        <w:t xml:space="preserve"> security review</w:t>
       </w:r>
     </w:p>
     <w:p>
@@ -24917,10 +24967,19 @@
       </w:pPr>
       <w:r>
         <w:rPr>
-          <w:sz w:val="32"/>
-          <w:szCs w:val="32"/>
-        </w:rPr>
-        <w:t>Flutter reviews</w:t>
+          <w:b/>
+          <w:bCs/>
+          <w:sz w:val="32"/>
+          <w:szCs w:val="32"/>
+        </w:rPr>
+        <w:t>Flutter</w:t>
+      </w:r>
+      <w:r>
+        <w:rPr>
+          <w:sz w:val="32"/>
+          <w:szCs w:val="32"/>
+        </w:rPr>
+        <w:t xml:space="preserve"> reviews</w:t>
       </w:r>
     </w:p>
     <w:p>
@@ -28277,6 +28336,7 @@
           <w:szCs w:val="32"/>
         </w:rPr>
       </w:pPr>
+      <w:bookmarkStart w:id="0" w:name="_Hlk236747087"/>
       <w:r>
         <w:rPr>
           <w:sz w:val="32"/>
@@ -28530,6 +28590,7 @@
         <w:t>$flutter-architecture-review</w:t>
       </w:r>
     </w:p>
+    <w:bookmarkEnd w:id="0"/>
     <w:p>
       <w:pPr>
         <w:jc w:val="both"/>
@@ -28933,7 +28994,37 @@
           <w:sz w:val="32"/>
           <w:szCs w:val="32"/>
         </w:rPr>
-        <w:t># Tell codex to scan the project and analyze test cases, sort them high priority wise and only implement the high priority tests</w:t>
+        <w:t xml:space="preserve"># Tell </w:t>
+      </w:r>
+      <w:r>
+        <w:rPr>
+          <w:b/>
+          <w:bCs/>
+          <w:sz w:val="32"/>
+          <w:szCs w:val="32"/>
+        </w:rPr>
+        <w:t>codex</w:t>
+      </w:r>
+      <w:r>
+        <w:rPr>
+          <w:sz w:val="32"/>
+          <w:szCs w:val="32"/>
+        </w:rPr>
+        <w:t xml:space="preserve"> to scan the project and analyze test cases, sort them high priority wise and onl</w:t>
+      </w:r>
+      <w:r>
+        <w:rPr>
+          <w:sz w:val="32"/>
+          <w:szCs w:val="32"/>
+        </w:rPr>
+        <w:t>y list</w:t>
+      </w:r>
+      <w:r>
+        <w:rPr>
+          <w:sz w:val="32"/>
+          <w:szCs w:val="32"/>
+        </w:rPr>
+        <w:t xml:space="preserve"> the high priority tests</w:t>
       </w:r>
     </w:p>
     <w:p>

</xml_diff>